<commit_message>
worked in polynomial files. it seems to work nice but with opposite sign
</commit_message>
<xml_diff>
--- a/docs/Перемещения МКЭ.docx
+++ b/docs/Перемещения МКЭ.docx
@@ -8,11 +8,19 @@
       </w:r>
     </w:p>
     <w:p>
-      <w:r>
+      <w:pPr>
+        <w:rPr>
+          <w:lang w:val="en-US"/>
+        </w:rPr>
+      </w:pPr>
+      <w:r>
+        <w:rPr>
+          <w:noProof/>
+        </w:rPr>
         <w:drawing>
-          <wp:inline distT="0" distB="0" distL="0" distR="0" wp14:anchorId="7E471798" wp14:editId="3D4A6AA3">
-            <wp:extent cx="5940425" cy="4157345"/>
-            <wp:effectExtent l="0" t="0" r="3175" b="0"/>
+          <wp:inline distT="0" distB="0" distL="0" distR="0" wp14:anchorId="7E471798" wp14:editId="62510A35">
+            <wp:extent cx="5936776" cy="4154791"/>
+            <wp:effectExtent l="0" t="0" r="6985" b="0"/>
             <wp:docPr id="1689374937" name="Рисунок 1"/>
             <wp:cNvGraphicFramePr>
               <a:graphicFrameLocks xmlns:a="http://schemas.openxmlformats.org/drawingml/2006/main" noChangeAspect="1"/>
@@ -33,7 +41,7 @@
                   <pic:spPr>
                     <a:xfrm>
                       <a:off x="0" y="0"/>
-                      <a:ext cx="5940425" cy="4157345"/>
+                      <a:ext cx="5947584" cy="4162355"/>
                     </a:xfrm>
                     <a:prstGeom prst="rect">
                       <a:avLst/>
@@ -48,12 +56,6 @@
     </w:p>
     <w:p>
       <w:r>
-        <w:t>Перемещения Бубнов-Галеркин</w:t>
-      </w:r>
-    </w:p>
-    <w:p/>
-    <w:p>
-      <w:r>
         <w:t xml:space="preserve">Моменты </w:t>
       </w:r>
       <w:r>
@@ -66,32 +68,21 @@
         <w:t xml:space="preserve"> МКЭ</w:t>
       </w:r>
     </w:p>
-    <w:p/>
-    <w:p>
-      <w:r>
-        <w:t xml:space="preserve">Моменты </w:t>
-      </w:r>
-      <w:r>
-        <w:rPr>
-          <w:lang w:val="en-US"/>
-        </w:rPr>
-        <w:t>Mx</w:t>
-      </w:r>
-      <w:r>
-        <w:t xml:space="preserve"> </w:t>
-      </w:r>
-      <w:r>
-        <w:t>Бубнов-Галеркин</w:t>
-      </w:r>
-    </w:p>
-    <w:p>
-      <w:r>
-        <w:lastRenderedPageBreak/>
+    <w:p>
+      <w:pPr>
+        <w:rPr>
+          <w:lang w:val="en-US"/>
+        </w:rPr>
+      </w:pPr>
+      <w:r>
+        <w:rPr>
+          <w:lang w:val="en-US"/>
+        </w:rPr>
         <w:drawing>
-          <wp:inline distT="0" distB="0" distL="0" distR="0" wp14:anchorId="18FE5240" wp14:editId="569E9B23">
-            <wp:extent cx="5940425" cy="4160520"/>
-            <wp:effectExtent l="0" t="0" r="3175" b="0"/>
-            <wp:docPr id="579297645" name="Рисунок 1"/>
+          <wp:inline distT="0" distB="0" distL="0" distR="0" wp14:anchorId="62C82336" wp14:editId="32FBC11C">
+            <wp:extent cx="5940425" cy="4132580"/>
+            <wp:effectExtent l="0" t="0" r="3175" b="1270"/>
+            <wp:docPr id="943282654" name="Рисунок 1"/>
             <wp:cNvGraphicFramePr>
               <a:graphicFrameLocks xmlns:a="http://schemas.openxmlformats.org/drawingml/2006/main" noChangeAspect="1"/>
             </wp:cNvGraphicFramePr>
@@ -99,7 +90,7 @@
               <a:graphicData uri="http://schemas.openxmlformats.org/drawingml/2006/picture">
                 <pic:pic xmlns:pic="http://schemas.openxmlformats.org/drawingml/2006/picture">
                   <pic:nvPicPr>
-                    <pic:cNvPr id="579297645" name=""/>
+                    <pic:cNvPr id="943282654" name=""/>
                     <pic:cNvPicPr/>
                   </pic:nvPicPr>
                   <pic:blipFill>
@@ -111,7 +102,7 @@
                   <pic:spPr>
                     <a:xfrm>
                       <a:off x="0" y="0"/>
-                      <a:ext cx="5940425" cy="4160520"/>
+                      <a:ext cx="5940425" cy="4132580"/>
                     </a:xfrm>
                     <a:prstGeom prst="rect">
                       <a:avLst/>
@@ -123,10 +114,603 @@
           </wp:inline>
         </w:drawing>
       </w:r>
-    </w:p>
-    <w:p/>
-    <w:p/>
-    <w:p/>
+      <w:r>
+        <w:rPr>
+          <w:lang w:val="en-US"/>
+        </w:rPr>
+        <w:br w:type="page"/>
+      </w:r>
+    </w:p>
+    <w:p>
+      <w:r>
+        <w:lastRenderedPageBreak/>
+        <w:t>Перемещения Бубнов-Галеркин</w:t>
+      </w:r>
+      <w:r>
+        <w:t xml:space="preserve"> </w:t>
+      </w:r>
+      <w:r>
+        <w:t xml:space="preserve">0 </w:t>
+      </w:r>
+      <w:r>
+        <w:t>приближение</w:t>
+      </w:r>
+    </w:p>
+    <w:p>
+      <w:r>
+        <w:drawing>
+          <wp:inline distT="0" distB="0" distL="0" distR="0" wp14:anchorId="3067951C" wp14:editId="5807BB98">
+            <wp:extent cx="6254387" cy="3002507"/>
+            <wp:effectExtent l="0" t="0" r="0" b="7620"/>
+            <wp:docPr id="1540319558" name="Рисунок 1"/>
+            <wp:cNvGraphicFramePr>
+              <a:graphicFrameLocks xmlns:a="http://schemas.openxmlformats.org/drawingml/2006/main" noChangeAspect="1"/>
+            </wp:cNvGraphicFramePr>
+            <a:graphic xmlns:a="http://schemas.openxmlformats.org/drawingml/2006/main">
+              <a:graphicData uri="http://schemas.openxmlformats.org/drawingml/2006/picture">
+                <pic:pic xmlns:pic="http://schemas.openxmlformats.org/drawingml/2006/picture">
+                  <pic:nvPicPr>
+                    <pic:cNvPr id="1540319558" name=""/>
+                    <pic:cNvPicPr/>
+                  </pic:nvPicPr>
+                  <pic:blipFill>
+                    <a:blip r:embed="rId6"/>
+                    <a:stretch>
+                      <a:fillRect/>
+                    </a:stretch>
+                  </pic:blipFill>
+                  <pic:spPr>
+                    <a:xfrm>
+                      <a:off x="0" y="0"/>
+                      <a:ext cx="6262062" cy="3006191"/>
+                    </a:xfrm>
+                    <a:prstGeom prst="rect">
+                      <a:avLst/>
+                    </a:prstGeom>
+                  </pic:spPr>
+                </pic:pic>
+              </a:graphicData>
+            </a:graphic>
+          </wp:inline>
+        </w:drawing>
+      </w:r>
+    </w:p>
+    <w:p>
+      <w:r>
+        <w:t xml:space="preserve">Перемещения Бубнов-Галеркин </w:t>
+      </w:r>
+      <w:r>
+        <w:t>1</w:t>
+      </w:r>
+      <w:r>
+        <w:t xml:space="preserve"> </w:t>
+      </w:r>
+      <w:r>
+        <w:t>приближение</w:t>
+      </w:r>
+    </w:p>
+    <w:p>
+      <w:pPr>
+        <w:rPr>
+          <w:lang w:val="en-US"/>
+        </w:rPr>
+      </w:pPr>
+      <w:r>
+        <w:drawing>
+          <wp:inline distT="0" distB="0" distL="0" distR="0" wp14:anchorId="18372CB5" wp14:editId="1E69C237">
+            <wp:extent cx="5940425" cy="3084195"/>
+            <wp:effectExtent l="0" t="0" r="3175" b="1905"/>
+            <wp:docPr id="583219234" name="Рисунок 1"/>
+            <wp:cNvGraphicFramePr>
+              <a:graphicFrameLocks xmlns:a="http://schemas.openxmlformats.org/drawingml/2006/main" noChangeAspect="1"/>
+            </wp:cNvGraphicFramePr>
+            <a:graphic xmlns:a="http://schemas.openxmlformats.org/drawingml/2006/main">
+              <a:graphicData uri="http://schemas.openxmlformats.org/drawingml/2006/picture">
+                <pic:pic xmlns:pic="http://schemas.openxmlformats.org/drawingml/2006/picture">
+                  <pic:nvPicPr>
+                    <pic:cNvPr id="583219234" name=""/>
+                    <pic:cNvPicPr/>
+                  </pic:nvPicPr>
+                  <pic:blipFill>
+                    <a:blip r:embed="rId7"/>
+                    <a:stretch>
+                      <a:fillRect/>
+                    </a:stretch>
+                  </pic:blipFill>
+                  <pic:spPr>
+                    <a:xfrm>
+                      <a:off x="0" y="0"/>
+                      <a:ext cx="5940425" cy="3084195"/>
+                    </a:xfrm>
+                    <a:prstGeom prst="rect">
+                      <a:avLst/>
+                    </a:prstGeom>
+                  </pic:spPr>
+                </pic:pic>
+              </a:graphicData>
+            </a:graphic>
+          </wp:inline>
+        </w:drawing>
+      </w:r>
+    </w:p>
+    <w:p>
+      <w:pPr>
+        <w:rPr>
+          <w:lang w:val="en-US"/>
+        </w:rPr>
+      </w:pPr>
+      <w:r>
+        <w:rPr>
+          <w:lang w:val="en-US"/>
+        </w:rPr>
+        <w:br w:type="page"/>
+      </w:r>
+    </w:p>
+    <w:p>
+      <w:r>
+        <w:lastRenderedPageBreak/>
+        <w:t xml:space="preserve">Перемещения Бубнов-Галеркин </w:t>
+      </w:r>
+      <w:r>
+        <w:t>0</w:t>
+      </w:r>
+      <w:r>
+        <w:t xml:space="preserve"> </w:t>
+      </w:r>
+      <w:r>
+        <w:t>приближение</w:t>
+      </w:r>
+      <w:r>
+        <w:t xml:space="preserve">. Только </w:t>
+      </w:r>
+      <w:r>
+        <w:rPr>
+          <w:b/>
+          <w:bCs/>
+          <w:lang w:val="en-US"/>
+        </w:rPr>
+        <w:t>cos</w:t>
+      </w:r>
+    </w:p>
+    <w:p>
+      <w:pPr>
+        <w:rPr>
+          <w:lang w:val="en-US"/>
+        </w:rPr>
+      </w:pPr>
+      <w:r>
+        <w:drawing>
+          <wp:inline distT="0" distB="0" distL="0" distR="0" wp14:anchorId="53A78B4B" wp14:editId="680BE241">
+            <wp:extent cx="5940425" cy="2885440"/>
+            <wp:effectExtent l="0" t="0" r="3175" b="0"/>
+            <wp:docPr id="1034220803" name="Рисунок 1"/>
+            <wp:cNvGraphicFramePr>
+              <a:graphicFrameLocks xmlns:a="http://schemas.openxmlformats.org/drawingml/2006/main" noChangeAspect="1"/>
+            </wp:cNvGraphicFramePr>
+            <a:graphic xmlns:a="http://schemas.openxmlformats.org/drawingml/2006/main">
+              <a:graphicData uri="http://schemas.openxmlformats.org/drawingml/2006/picture">
+                <pic:pic xmlns:pic="http://schemas.openxmlformats.org/drawingml/2006/picture">
+                  <pic:nvPicPr>
+                    <pic:cNvPr id="1034220803" name=""/>
+                    <pic:cNvPicPr/>
+                  </pic:nvPicPr>
+                  <pic:blipFill>
+                    <a:blip r:embed="rId8"/>
+                    <a:stretch>
+                      <a:fillRect/>
+                    </a:stretch>
+                  </pic:blipFill>
+                  <pic:spPr>
+                    <a:xfrm>
+                      <a:off x="0" y="0"/>
+                      <a:ext cx="5940425" cy="2885440"/>
+                    </a:xfrm>
+                    <a:prstGeom prst="rect">
+                      <a:avLst/>
+                    </a:prstGeom>
+                  </pic:spPr>
+                </pic:pic>
+              </a:graphicData>
+            </a:graphic>
+          </wp:inline>
+        </w:drawing>
+      </w:r>
+    </w:p>
+    <w:p>
+      <w:r>
+        <w:t>Перемещения в центре, мм 9.</w:t>
+      </w:r>
+      <w:r>
+        <w:t>8</w:t>
+      </w:r>
+    </w:p>
+    <w:p>
+      <w:r>
+        <w:t xml:space="preserve">Перемещения Бубнов-Галеркин </w:t>
+      </w:r>
+      <w:r>
+        <w:rPr>
+          <w:lang w:val="en-US"/>
+        </w:rPr>
+        <w:t>1</w:t>
+      </w:r>
+      <w:r>
+        <w:t xml:space="preserve"> </w:t>
+      </w:r>
+      <w:r>
+        <w:t xml:space="preserve">приближение. Только </w:t>
+      </w:r>
+      <w:r>
+        <w:rPr>
+          <w:b/>
+          <w:bCs/>
+          <w:lang w:val="en-US"/>
+        </w:rPr>
+        <w:t>cos</w:t>
+      </w:r>
+    </w:p>
+    <w:p>
+      <w:r>
+        <w:rPr>
+          <w:lang w:val="en-US"/>
+        </w:rPr>
+        <w:drawing>
+          <wp:inline distT="0" distB="0" distL="0" distR="0" wp14:anchorId="36B3EF0F" wp14:editId="78E2C157">
+            <wp:extent cx="5940425" cy="2875280"/>
+            <wp:effectExtent l="0" t="0" r="3175" b="1270"/>
+            <wp:docPr id="458387858" name="Рисунок 1"/>
+            <wp:cNvGraphicFramePr>
+              <a:graphicFrameLocks xmlns:a="http://schemas.openxmlformats.org/drawingml/2006/main" noChangeAspect="1"/>
+            </wp:cNvGraphicFramePr>
+            <a:graphic xmlns:a="http://schemas.openxmlformats.org/drawingml/2006/main">
+              <a:graphicData uri="http://schemas.openxmlformats.org/drawingml/2006/picture">
+                <pic:pic xmlns:pic="http://schemas.openxmlformats.org/drawingml/2006/picture">
+                  <pic:nvPicPr>
+                    <pic:cNvPr id="1814146858" name=""/>
+                    <pic:cNvPicPr/>
+                  </pic:nvPicPr>
+                  <pic:blipFill>
+                    <a:blip r:embed="rId9"/>
+                    <a:stretch>
+                      <a:fillRect/>
+                    </a:stretch>
+                  </pic:blipFill>
+                  <pic:spPr>
+                    <a:xfrm>
+                      <a:off x="0" y="0"/>
+                      <a:ext cx="5940425" cy="2875280"/>
+                    </a:xfrm>
+                    <a:prstGeom prst="rect">
+                      <a:avLst/>
+                    </a:prstGeom>
+                  </pic:spPr>
+                </pic:pic>
+              </a:graphicData>
+            </a:graphic>
+          </wp:inline>
+        </w:drawing>
+      </w:r>
+    </w:p>
+    <w:p>
+      <w:pPr>
+        <w:rPr>
+          <w:lang w:val="en-US"/>
+        </w:rPr>
+      </w:pPr>
+      <w:r>
+        <w:rPr>
+          <w:lang w:val="en-US"/>
+        </w:rPr>
+        <w:br w:type="page"/>
+      </w:r>
+    </w:p>
+    <w:p>
+      <w:r>
+        <w:lastRenderedPageBreak/>
+        <w:t xml:space="preserve">Моменты </w:t>
+      </w:r>
+      <w:r>
+        <w:rPr>
+          <w:lang w:val="en-US"/>
+        </w:rPr>
+        <w:t>Mx</w:t>
+      </w:r>
+      <w:r>
+        <w:t xml:space="preserve"> Бубнов-Галеркин</w:t>
+      </w:r>
+      <w:r>
+        <w:t xml:space="preserve"> 0 </w:t>
+      </w:r>
+      <w:r>
+        <w:t>приближение</w:t>
+      </w:r>
+    </w:p>
+    <w:p>
+      <w:r>
+        <w:drawing>
+          <wp:inline distT="0" distB="0" distL="0" distR="0" wp14:anchorId="32948B6B" wp14:editId="2DEBF84B">
+            <wp:extent cx="5940425" cy="2806700"/>
+            <wp:effectExtent l="0" t="0" r="3175" b="0"/>
+            <wp:docPr id="657485633" name="Рисунок 1"/>
+            <wp:cNvGraphicFramePr>
+              <a:graphicFrameLocks xmlns:a="http://schemas.openxmlformats.org/drawingml/2006/main" noChangeAspect="1"/>
+            </wp:cNvGraphicFramePr>
+            <a:graphic xmlns:a="http://schemas.openxmlformats.org/drawingml/2006/main">
+              <a:graphicData uri="http://schemas.openxmlformats.org/drawingml/2006/picture">
+                <pic:pic xmlns:pic="http://schemas.openxmlformats.org/drawingml/2006/picture">
+                  <pic:nvPicPr>
+                    <pic:cNvPr id="657485633" name=""/>
+                    <pic:cNvPicPr/>
+                  </pic:nvPicPr>
+                  <pic:blipFill>
+                    <a:blip r:embed="rId10"/>
+                    <a:stretch>
+                      <a:fillRect/>
+                    </a:stretch>
+                  </pic:blipFill>
+                  <pic:spPr>
+                    <a:xfrm>
+                      <a:off x="0" y="0"/>
+                      <a:ext cx="5940425" cy="2806700"/>
+                    </a:xfrm>
+                    <a:prstGeom prst="rect">
+                      <a:avLst/>
+                    </a:prstGeom>
+                  </pic:spPr>
+                </pic:pic>
+              </a:graphicData>
+            </a:graphic>
+          </wp:inline>
+        </w:drawing>
+      </w:r>
+    </w:p>
+    <w:p>
+      <w:r>
+        <w:t xml:space="preserve">Моменты </w:t>
+      </w:r>
+      <w:r>
+        <w:rPr>
+          <w:lang w:val="en-US"/>
+        </w:rPr>
+        <w:t>Mx</w:t>
+      </w:r>
+      <w:r>
+        <w:t xml:space="preserve"> Бубнов-Галеркин</w:t>
+      </w:r>
+      <w:r>
+        <w:t xml:space="preserve"> </w:t>
+      </w:r>
+      <w:r>
+        <w:t>1</w:t>
+      </w:r>
+      <w:r>
+        <w:t xml:space="preserve"> </w:t>
+      </w:r>
+      <w:r>
+        <w:t>приближение</w:t>
+      </w:r>
+    </w:p>
+    <w:p>
+      <w:pPr>
+        <w:rPr>
+          <w:lang w:val="en-US"/>
+        </w:rPr>
+      </w:pPr>
+      <w:r>
+        <w:drawing>
+          <wp:inline distT="0" distB="0" distL="0" distR="0" wp14:anchorId="626A7784" wp14:editId="1073D483">
+            <wp:extent cx="5940425" cy="2825115"/>
+            <wp:effectExtent l="0" t="0" r="3175" b="0"/>
+            <wp:docPr id="391025237" name="Рисунок 1"/>
+            <wp:cNvGraphicFramePr>
+              <a:graphicFrameLocks xmlns:a="http://schemas.openxmlformats.org/drawingml/2006/main" noChangeAspect="1"/>
+            </wp:cNvGraphicFramePr>
+            <a:graphic xmlns:a="http://schemas.openxmlformats.org/drawingml/2006/main">
+              <a:graphicData uri="http://schemas.openxmlformats.org/drawingml/2006/picture">
+                <pic:pic xmlns:pic="http://schemas.openxmlformats.org/drawingml/2006/picture">
+                  <pic:nvPicPr>
+                    <pic:cNvPr id="391025237" name=""/>
+                    <pic:cNvPicPr/>
+                  </pic:nvPicPr>
+                  <pic:blipFill>
+                    <a:blip r:embed="rId11"/>
+                    <a:stretch>
+                      <a:fillRect/>
+                    </a:stretch>
+                  </pic:blipFill>
+                  <pic:spPr>
+                    <a:xfrm>
+                      <a:off x="0" y="0"/>
+                      <a:ext cx="5940425" cy="2825115"/>
+                    </a:xfrm>
+                    <a:prstGeom prst="rect">
+                      <a:avLst/>
+                    </a:prstGeom>
+                  </pic:spPr>
+                </pic:pic>
+              </a:graphicData>
+            </a:graphic>
+          </wp:inline>
+        </w:drawing>
+      </w:r>
+    </w:p>
+    <w:p>
+      <w:pPr>
+        <w:rPr>
+          <w:lang w:val="en-US"/>
+        </w:rPr>
+      </w:pPr>
+      <w:r>
+        <w:rPr>
+          <w:lang w:val="en-US"/>
+        </w:rPr>
+        <w:br w:type="page"/>
+      </w:r>
+    </w:p>
+    <w:p>
+      <w:r>
+        <w:lastRenderedPageBreak/>
+        <w:t xml:space="preserve">Моменты </w:t>
+      </w:r>
+      <w:r>
+        <w:rPr>
+          <w:lang w:val="en-US"/>
+        </w:rPr>
+        <w:t>Mx</w:t>
+      </w:r>
+      <w:r>
+        <w:t xml:space="preserve"> Бубнов-Галеркин 0</w:t>
+      </w:r>
+      <w:r>
+        <w:t xml:space="preserve"> </w:t>
+      </w:r>
+      <w:r>
+        <w:t xml:space="preserve">приближение. Только </w:t>
+      </w:r>
+      <w:r>
+        <w:rPr>
+          <w:b/>
+          <w:bCs/>
+          <w:lang w:val="en-US"/>
+        </w:rPr>
+        <w:t>cos</w:t>
+      </w:r>
+    </w:p>
+    <w:p>
+      <w:r>
+        <w:drawing>
+          <wp:inline distT="0" distB="0" distL="0" distR="0" wp14:anchorId="7BB529D5" wp14:editId="3E30D5DC">
+            <wp:extent cx="5940425" cy="2870835"/>
+            <wp:effectExtent l="0" t="0" r="3175" b="5715"/>
+            <wp:docPr id="1156674627" name="Рисунок 1"/>
+            <wp:cNvGraphicFramePr>
+              <a:graphicFrameLocks xmlns:a="http://schemas.openxmlformats.org/drawingml/2006/main" noChangeAspect="1"/>
+            </wp:cNvGraphicFramePr>
+            <a:graphic xmlns:a="http://schemas.openxmlformats.org/drawingml/2006/main">
+              <a:graphicData uri="http://schemas.openxmlformats.org/drawingml/2006/picture">
+                <pic:pic xmlns:pic="http://schemas.openxmlformats.org/drawingml/2006/picture">
+                  <pic:nvPicPr>
+                    <pic:cNvPr id="1156674627" name=""/>
+                    <pic:cNvPicPr/>
+                  </pic:nvPicPr>
+                  <pic:blipFill>
+                    <a:blip r:embed="rId12"/>
+                    <a:stretch>
+                      <a:fillRect/>
+                    </a:stretch>
+                  </pic:blipFill>
+                  <pic:spPr>
+                    <a:xfrm>
+                      <a:off x="0" y="0"/>
+                      <a:ext cx="5940425" cy="2870835"/>
+                    </a:xfrm>
+                    <a:prstGeom prst="rect">
+                      <a:avLst/>
+                    </a:prstGeom>
+                  </pic:spPr>
+                </pic:pic>
+              </a:graphicData>
+            </a:graphic>
+          </wp:inline>
+        </w:drawing>
+      </w:r>
+    </w:p>
+    <w:p>
+      <w:pPr>
+        <w:rPr>
+          <w:lang w:val="en-US"/>
+        </w:rPr>
+      </w:pPr>
+      <w:r>
+        <w:t>Изгибающий момент в центре на краю, кНм 5.1</w:t>
+      </w:r>
+    </w:p>
+    <w:p>
+      <w:r>
+        <w:t xml:space="preserve">Моменты </w:t>
+      </w:r>
+      <w:r>
+        <w:rPr>
+          <w:lang w:val="en-US"/>
+        </w:rPr>
+        <w:t>Mx</w:t>
+      </w:r>
+      <w:r>
+        <w:t xml:space="preserve"> Бубнов-Галеркин </w:t>
+      </w:r>
+      <w:r>
+        <w:t>1</w:t>
+      </w:r>
+      <w:r>
+        <w:t xml:space="preserve"> </w:t>
+      </w:r>
+      <w:r>
+        <w:t xml:space="preserve">приближение. Только </w:t>
+      </w:r>
+      <w:r>
+        <w:rPr>
+          <w:b/>
+          <w:bCs/>
+          <w:lang w:val="en-US"/>
+        </w:rPr>
+        <w:t>cos</w:t>
+      </w:r>
+    </w:p>
+    <w:p>
+      <w:pPr>
+        <w:rPr>
+          <w:lang w:val="en-US"/>
+        </w:rPr>
+      </w:pPr>
+      <w:r>
+        <w:rPr>
+          <w:lang w:val="en-US"/>
+        </w:rPr>
+        <w:drawing>
+          <wp:inline distT="0" distB="0" distL="0" distR="0" wp14:anchorId="76917D7C" wp14:editId="15D45C25">
+            <wp:extent cx="5940425" cy="2910205"/>
+            <wp:effectExtent l="0" t="0" r="3175" b="4445"/>
+            <wp:docPr id="626929623" name="Рисунок 1"/>
+            <wp:cNvGraphicFramePr>
+              <a:graphicFrameLocks xmlns:a="http://schemas.openxmlformats.org/drawingml/2006/main" noChangeAspect="1"/>
+            </wp:cNvGraphicFramePr>
+            <a:graphic xmlns:a="http://schemas.openxmlformats.org/drawingml/2006/main">
+              <a:graphicData uri="http://schemas.openxmlformats.org/drawingml/2006/picture">
+                <pic:pic xmlns:pic="http://schemas.openxmlformats.org/drawingml/2006/picture">
+                  <pic:nvPicPr>
+                    <pic:cNvPr id="626929623" name=""/>
+                    <pic:cNvPicPr/>
+                  </pic:nvPicPr>
+                  <pic:blipFill>
+                    <a:blip r:embed="rId13"/>
+                    <a:stretch>
+                      <a:fillRect/>
+                    </a:stretch>
+                  </pic:blipFill>
+                  <pic:spPr>
+                    <a:xfrm>
+                      <a:off x="0" y="0"/>
+                      <a:ext cx="5940425" cy="2910205"/>
+                    </a:xfrm>
+                    <a:prstGeom prst="rect">
+                      <a:avLst/>
+                    </a:prstGeom>
+                  </pic:spPr>
+                </pic:pic>
+              </a:graphicData>
+            </a:graphic>
+          </wp:inline>
+        </w:drawing>
+      </w:r>
+    </w:p>
+    <w:p>
+      <w:r>
+        <w:t>Изгибающий момент в центре на краю, кНм 5.</w:t>
+      </w:r>
+      <w:r>
+        <w:t>6</w:t>
+      </w:r>
+    </w:p>
     <w:sectPr>
       <w:pgSz w:w="11906" w:h="16838"/>
       <w:pgMar w:top="1134" w:right="850" w:bottom="1134" w:left="1701" w:header="708" w:footer="708" w:gutter="0"/>

</xml_diff>